<commit_message>
snakes noodles and strings
</commit_message>
<xml_diff>
--- a/tex/git_cv/NicholasHayekCV.docx
+++ b/tex/git_cv/NicholasHayekCV.docx
@@ -434,7 +434,23 @@
           <w:sz w:val="19"/>
           <w:szCs w:val="19"/>
         </w:rPr>
-        <w:t>Quantitative Risk Management, Machine Learning, Stochastic Processes</w:t>
+        <w:t>Stochastic Processes</w:t>
+      </w:r>
+      <w:r>
+        <w:rPr>
+          <w:rFonts w:ascii="Garamond" w:hAnsi="Garamond" w:cs="Times New Roman"/>
+          <w:sz w:val="19"/>
+          <w:szCs w:val="19"/>
+        </w:rPr>
+        <w:t xml:space="preserve">, </w:t>
+      </w:r>
+      <w:r>
+        <w:rPr>
+          <w:rFonts w:ascii="Garamond" w:hAnsi="Garamond" w:cs="Times New Roman"/>
+          <w:sz w:val="19"/>
+          <w:szCs w:val="19"/>
+        </w:rPr>
+        <w:t>Quantitative Risk Management, Machine Learning</w:t>
       </w:r>
       <w:r>
         <w:rPr>
@@ -1561,25 +1577,7 @@
           <w:sz w:val="20"/>
           <w:szCs w:val="20"/>
         </w:rPr>
-        <w:t xml:space="preserve"> </w:t>
-      </w:r>
-      <w:proofErr w:type="spellStart"/>
-      <w:r>
-        <w:rPr>
-          <w:rFonts w:ascii="Garamond" w:hAnsi="Garamond" w:cs="Times New Roman"/>
-          <w:sz w:val="20"/>
-          <w:szCs w:val="20"/>
-        </w:rPr>
-        <w:t>supersingular</w:t>
-      </w:r>
-      <w:proofErr w:type="spellEnd"/>
-      <w:r>
-        <w:rPr>
-          <w:rFonts w:ascii="Garamond" w:hAnsi="Garamond" w:cs="Times New Roman"/>
-          <w:sz w:val="20"/>
-          <w:szCs w:val="20"/>
-        </w:rPr>
-        <w:t xml:space="preserve"> elliptic curve isogeny graphs</w:t>
+        <w:t xml:space="preserve"> supersingular elliptic curve isogeny graphs</w:t>
       </w:r>
       <w:r>
         <w:rPr>
@@ -1637,18 +1635,8 @@
           <w:sz w:val="20"/>
           <w:szCs w:val="20"/>
         </w:rPr>
-        <w:t xml:space="preserve"> </w:t>
-      </w:r>
-      <w:proofErr w:type="spellStart"/>
-      <w:r>
-        <w:rPr>
-          <w:rFonts w:ascii="Garamond" w:hAnsi="Garamond" w:cs="Times New Roman"/>
-          <w:sz w:val="20"/>
-          <w:szCs w:val="20"/>
-        </w:rPr>
-        <w:t>supersingular</w:t>
-      </w:r>
-      <w:proofErr w:type="spellEnd"/>
+        <w:t xml:space="preserve"> supersingular</w:t>
+      </w:r>
       <w:r>
         <w:rPr>
           <w:rFonts w:ascii="Garamond" w:hAnsi="Garamond" w:cs="Times New Roman"/>

</xml_diff>